<commit_message>
Mark G-2 resolved in grievance flow review (components removed by owner)
Co-Authored-By: Claude Fable 5 <noreply@anthropic.com>
Claude-Session: https://claude.ai/code/session_01LikXTiVDyR24xCRvYkrPvc
</commit_message>
<xml_diff>
--- a/docs/Individual_Rights_Grievance_Flow_Review.docx
+++ b/docs/Individual_Rights_Grievance_Flow_Review.docx
@@ -21,7 +21,7 @@
         </w:rPr>
         <w:t>Screen Flow review — findings and recommendations</w:t>
         <w:br/>
-        <w:t>Flow API Version 63.0  |  Flow status: DRAFT (not yet activated)  |  Review date: July 3, 2026</w:t>
+        <w:t>Flow API Version 63.0  |  Flow status: DRAFT (not yet activated)  |  Review date: July 3, 2026 (rev. 2 — G-2 resolved by component removal)</w:t>
         <w:br/>
         <w:t>Built from the same DocGen_Template as Money Management Assessment TX; reviewed in that context.</w:t>
       </w:r>
@@ -61,7 +61,7 @@
           <w:b w:val="0"/>
           <w:i w:val="0"/>
         </w:rPr>
-        <w:t>Two screen components (Contact Name and Phone/Email under 'Questions?') are wired to no record field at all — data typed there is lost even after the mapping fix. Several smaller items follow, including choice-value whitespace that will leak into the Conga document, a field-length risk on the multi-select, and the same template-inherited gaps found in the first review (missing fault connector on the draft-save update, unused Get Admission Record query, no null check on the existing-record lookup).</w:t>
+        <w:t>Two screen components (Contact Name and Phone/Email under 'Questions?') were wired to no record field at all; the flow owner has since deleted them from the screen, resolving that finding (G-2). Remaining items include choice-value whitespace that will leak into the Conga document, a field-length risk on the multi-select, and the same template-inherited gaps found in the first review (missing fault connector on the draft-save update, unused Get Admission Record query, no null check on the existing-record lookup).</w:t>
       </w:r>
     </w:p>
     <w:p>
@@ -241,7 +241,7 @@
         <w:rPr>
           <w:color w:val="1F3B57"/>
         </w:rPr>
-        <w:t>G-2. Two screen fields are wired to no record field at all</w:t>
+        <w:t>G-2. Two screen fields were wired to no record field — RESOLVED (removed)</w:t>
       </w:r>
     </w:p>
     <w:p>
@@ -254,9 +254,9 @@
       <w:r>
         <w:rPr>
           <w:b/>
-          <w:color w:val="B03030"/>
+          <w:color w:val="2E7D32"/>
         </w:rPr>
-        <w:t>HIGH — silent data loss even after G-1</w:t>
+        <w:t>RESOLVED — components deleted by flow owner</w:t>
       </w:r>
     </w:p>
     <w:p>
@@ -265,16 +265,7 @@
           <w:b w:val="0"/>
           <w:i w:val="0"/>
         </w:rPr>
-        <w:t>Contact_Name and Phone_Email_etc (the 'Questions? If you have any questions, please contact ___ at ___' section at the bottom of the screen) have no defaultValue and no corresponding Form_Document__c field. Anything typed there is discarded on Save Draft and cannot be merged into the Conga document.</w:t>
-      </w:r>
-    </w:p>
-    <w:p>
-      <w:r>
-        <w:rPr>
-          <w:b/>
-          <w:i w:val="0"/>
-        </w:rPr>
-        <w:t>Fix: assign two available fields (the flow currently uses up to Text_70__c — e.g. Text_71__c / Text_72__c if they exist on the object, or create them), then add both the defaultValue on the screen components and the two write-back rows in Update Record Variables. Alternatively, if this section is meant to be static display filled by the letter author elsewhere, convert it to Display Text so it cannot silently swallow input.</w:t>
+        <w:t>Contact_Name and Phone_Email_etc (the 'Questions?' section at the bottom of the screen) had no defaultValue and no corresponding Form_Document__c field, so anything typed there would have been discarded on Save Draft. The flow owner confirmed the inputs are not needed and deleted them from the screen. With their removal, the generated 87-row Update Record Variables mapping covers every remaining editable component one-to-one — the mapping is complete as delivered, no regeneration required.</w:t>
       </w:r>
     </w:p>
     <w:p>
@@ -651,7 +642,7 @@
           </w:tcPr>
           <w:p>
             <w:r>
-              <w:t>G-2  Map Contact_Name / Phone_Email_etc to record fields</w:t>
+              <w:t>G-2  Unmapped Contact_Name / Phone_Email_etc — resolved (deleted from screen)</w:t>
             </w:r>
           </w:p>
         </w:tc>
@@ -661,7 +652,7 @@
           </w:tcPr>
           <w:p>
             <w:r>
-              <w:t>Small</w:t>
+              <w:t>Done</w:t>
             </w:r>
           </w:p>
         </w:tc>
@@ -671,7 +662,7 @@
           </w:tcPr>
           <w:p>
             <w:r>
-              <w:t>Silent data loss</w:t>
+              <w:t>—</w:t>
             </w:r>
           </w:p>
         </w:tc>

</xml_diff>